<commit_message>
def setup inicial creeper
</commit_message>
<xml_diff>
--- a/python/creeper/documento.docx
+++ b/python/creeper/documento.docx
@@ -14,11 +14,4 @@
     </w:p>
   </w:body>
 </w:document>
-</file>
-
-<file path=creeper_infection/.creeper_marker.txt>CREEPER VIRUS - INFECTION MARKER
-Timestamp: 2026-07-08 17:47:49.801836
-Original file: documento.docx
-This file was infected by the Creeper educational virus.
-
 </file>
</xml_diff>